<commit_message>
Histoire T9 : 9 scènes (u2s18, u3s1-4, u4s1-4) + rebuild unités 3 et 4 avec illustrations
Co-authored-by: arena-agent <297053741+arena-agent@users.noreply.github.com>
</commit_message>
<xml_diff>
--- a/manuel-histoire-t9/Manuel_Histoire_T9_UNITE3.docx
+++ b/manuel-histoire-t9/Manuel_Histoire_T9_UNITE3.docx
@@ -2700,6 +2700,52 @@
     </w:p>
     <w:p>
       <w:pPr>
+        <w:spacing w:before="120" w:after="120"/>
+        <w:jc w:val="center"/>
+      </w:pPr>
+      <w:r>
+        <w:drawing>
+          <wp:inline distT="0" distB="0" distL="0" distR="0">
+            <wp:extent cx="4095750" cy="2238375"/>
+            <wp:effectExtent t="0" r="0" b="0" l="0"/>
+            <wp:docPr id="1" name="" descr="" title=""/>
+            <wp:cNvGraphicFramePr>
+              <a:graphicFrameLocks xmlns:a="http://schemas.openxmlformats.org/drawingml/2006/main" noChangeAspect="1"/>
+            </wp:cNvGraphicFramePr>
+            <a:graphic xmlns:a="http://schemas.openxmlformats.org/drawingml/2006/main">
+              <a:graphicData uri="http://schemas.openxmlformats.org/drawingml/2006/picture">
+                <pic:pic xmlns:pic="http://schemas.openxmlformats.org/drawingml/2006/picture">
+                  <pic:nvPicPr>
+                    <pic:cNvPr id="0" name="" descr=""/>
+                    <pic:cNvPicPr>
+                      <a:picLocks noChangeAspect="1" noChangeArrowheads="1"/>
+                    </pic:cNvPicPr>
+                  </pic:nvPicPr>
+                  <pic:blipFill>
+                    <a:blip r:embed="rId8" cstate="none"/>
+                    <a:srcRect/>
+                    <a:stretch>
+                      <a:fillRect/>
+                    </a:stretch>
+                  </pic:blipFill>
+                  <pic:spPr bwMode="auto">
+                    <a:xfrm>
+                      <a:off x="0" y="0"/>
+                      <a:ext cx="4095750" cy="2238375"/>
+                    </a:xfrm>
+                    <a:prstGeom prst="rect">
+                      <a:avLst/>
+                    </a:prstGeom>
+                  </pic:spPr>
+                </pic:pic>
+              </a:graphicData>
+            </a:graphic>
+          </wp:inline>
+        </w:drawing>
+      </w:r>
+    </w:p>
+    <w:p>
+      <w:pPr>
         <w:spacing w:after="160" w:line="300"/>
         <w:jc w:val="center"/>
       </w:pPr>
@@ -3286,7 +3332,7 @@
                     </pic:cNvPicPr>
                   </pic:nvPicPr>
                   <pic:blipFill>
-                    <a:blip r:embed="rId8" cstate="none"/>
+                    <a:blip r:embed="rId9" cstate="none"/>
                     <a:srcRect/>
                     <a:stretch>
                       <a:fillRect/>
@@ -6518,6 +6564,52 @@
     </w:p>
     <w:p>
       <w:pPr>
+        <w:spacing w:before="120" w:after="120"/>
+        <w:jc w:val="center"/>
+      </w:pPr>
+      <w:r>
+        <w:drawing>
+          <wp:inline distT="0" distB="0" distL="0" distR="0">
+            <wp:extent cx="4095750" cy="2238375"/>
+            <wp:effectExtent t="0" r="0" b="0" l="0"/>
+            <wp:docPr id="1" name="" descr="" title=""/>
+            <wp:cNvGraphicFramePr>
+              <a:graphicFrameLocks xmlns:a="http://schemas.openxmlformats.org/drawingml/2006/main" noChangeAspect="1"/>
+            </wp:cNvGraphicFramePr>
+            <a:graphic xmlns:a="http://schemas.openxmlformats.org/drawingml/2006/main">
+              <a:graphicData uri="http://schemas.openxmlformats.org/drawingml/2006/picture">
+                <pic:pic xmlns:pic="http://schemas.openxmlformats.org/drawingml/2006/picture">
+                  <pic:nvPicPr>
+                    <pic:cNvPr id="0" name="" descr=""/>
+                    <pic:cNvPicPr>
+                      <a:picLocks noChangeAspect="1" noChangeArrowheads="1"/>
+                    </pic:cNvPicPr>
+                  </pic:nvPicPr>
+                  <pic:blipFill>
+                    <a:blip r:embed="rId10" cstate="none"/>
+                    <a:srcRect/>
+                    <a:stretch>
+                      <a:fillRect/>
+                    </a:stretch>
+                  </pic:blipFill>
+                  <pic:spPr bwMode="auto">
+                    <a:xfrm>
+                      <a:off x="0" y="0"/>
+                      <a:ext cx="4095750" cy="2238375"/>
+                    </a:xfrm>
+                    <a:prstGeom prst="rect">
+                      <a:avLst/>
+                    </a:prstGeom>
+                  </pic:spPr>
+                </pic:pic>
+              </a:graphicData>
+            </a:graphic>
+          </wp:inline>
+        </w:drawing>
+      </w:r>
+    </w:p>
+    <w:p>
+      <w:pPr>
         <w:spacing w:after="160" w:line="300"/>
         <w:jc w:val="center"/>
       </w:pPr>
@@ -7087,7 +7179,7 @@
                     </pic:cNvPicPr>
                   </pic:nvPicPr>
                   <pic:blipFill>
-                    <a:blip r:embed="rId9" cstate="none"/>
+                    <a:blip r:embed="rId11" cstate="none"/>
                     <a:srcRect/>
                     <a:stretch>
                       <a:fillRect/>
@@ -10319,6 +10411,52 @@
     </w:p>
     <w:p>
       <w:pPr>
+        <w:spacing w:before="120" w:after="120"/>
+        <w:jc w:val="center"/>
+      </w:pPr>
+      <w:r>
+        <w:drawing>
+          <wp:inline distT="0" distB="0" distL="0" distR="0">
+            <wp:extent cx="4095750" cy="2238375"/>
+            <wp:effectExtent t="0" r="0" b="0" l="0"/>
+            <wp:docPr id="1" name="" descr="" title=""/>
+            <wp:cNvGraphicFramePr>
+              <a:graphicFrameLocks xmlns:a="http://schemas.openxmlformats.org/drawingml/2006/main" noChangeAspect="1"/>
+            </wp:cNvGraphicFramePr>
+            <a:graphic xmlns:a="http://schemas.openxmlformats.org/drawingml/2006/main">
+              <a:graphicData uri="http://schemas.openxmlformats.org/drawingml/2006/picture">
+                <pic:pic xmlns:pic="http://schemas.openxmlformats.org/drawingml/2006/picture">
+                  <pic:nvPicPr>
+                    <pic:cNvPr id="0" name="" descr=""/>
+                    <pic:cNvPicPr>
+                      <a:picLocks noChangeAspect="1" noChangeArrowheads="1"/>
+                    </pic:cNvPicPr>
+                  </pic:nvPicPr>
+                  <pic:blipFill>
+                    <a:blip r:embed="rId12" cstate="none"/>
+                    <a:srcRect/>
+                    <a:stretch>
+                      <a:fillRect/>
+                    </a:stretch>
+                  </pic:blipFill>
+                  <pic:spPr bwMode="auto">
+                    <a:xfrm>
+                      <a:off x="0" y="0"/>
+                      <a:ext cx="4095750" cy="2238375"/>
+                    </a:xfrm>
+                    <a:prstGeom prst="rect">
+                      <a:avLst/>
+                    </a:prstGeom>
+                  </pic:spPr>
+                </pic:pic>
+              </a:graphicData>
+            </a:graphic>
+          </wp:inline>
+        </w:drawing>
+      </w:r>
+    </w:p>
+    <w:p>
+      <w:pPr>
         <w:spacing w:after="160" w:line="300"/>
         <w:jc w:val="center"/>
       </w:pPr>
@@ -10687,7 +10825,7 @@
                     </pic:cNvPicPr>
                   </pic:nvPicPr>
                   <pic:blipFill>
-                    <a:blip r:embed="rId10" cstate="none"/>
+                    <a:blip r:embed="rId13" cstate="none"/>
                     <a:srcRect/>
                     <a:stretch>
                       <a:fillRect/>
@@ -13919,6 +14057,52 @@
     </w:p>
     <w:p>
       <w:pPr>
+        <w:spacing w:before="120" w:after="120"/>
+        <w:jc w:val="center"/>
+      </w:pPr>
+      <w:r>
+        <w:drawing>
+          <wp:inline distT="0" distB="0" distL="0" distR="0">
+            <wp:extent cx="4095750" cy="2238375"/>
+            <wp:effectExtent t="0" r="0" b="0" l="0"/>
+            <wp:docPr id="1" name="" descr="" title=""/>
+            <wp:cNvGraphicFramePr>
+              <a:graphicFrameLocks xmlns:a="http://schemas.openxmlformats.org/drawingml/2006/main" noChangeAspect="1"/>
+            </wp:cNvGraphicFramePr>
+            <a:graphic xmlns:a="http://schemas.openxmlformats.org/drawingml/2006/main">
+              <a:graphicData uri="http://schemas.openxmlformats.org/drawingml/2006/picture">
+                <pic:pic xmlns:pic="http://schemas.openxmlformats.org/drawingml/2006/picture">
+                  <pic:nvPicPr>
+                    <pic:cNvPr id="0" name="" descr=""/>
+                    <pic:cNvPicPr>
+                      <a:picLocks noChangeAspect="1" noChangeArrowheads="1"/>
+                    </pic:cNvPicPr>
+                  </pic:nvPicPr>
+                  <pic:blipFill>
+                    <a:blip r:embed="rId14" cstate="none"/>
+                    <a:srcRect/>
+                    <a:stretch>
+                      <a:fillRect/>
+                    </a:stretch>
+                  </pic:blipFill>
+                  <pic:spPr bwMode="auto">
+                    <a:xfrm>
+                      <a:off x="0" y="0"/>
+                      <a:ext cx="4095750" cy="2238375"/>
+                    </a:xfrm>
+                    <a:prstGeom prst="rect">
+                      <a:avLst/>
+                    </a:prstGeom>
+                  </pic:spPr>
+                </pic:pic>
+              </a:graphicData>
+            </a:graphic>
+          </wp:inline>
+        </w:drawing>
+      </w:r>
+    </w:p>
+    <w:p>
+      <w:pPr>
         <w:spacing w:after="160" w:line="300"/>
         <w:jc w:val="center"/>
       </w:pPr>
@@ -14495,7 +14679,7 @@
                     </pic:cNvPicPr>
                   </pic:nvPicPr>
                   <pic:blipFill>
-                    <a:blip r:embed="rId11" cstate="none"/>
+                    <a:blip r:embed="rId15" cstate="none"/>
                     <a:srcRect/>
                     <a:stretch>
                       <a:fillRect/>

</xml_diff>